<commit_message>
added the dataset into this file
</commit_message>
<xml_diff>
--- a/SIMPLE SETUP.docx
+++ b/SIMPLE SETUP.docx
@@ -792,52 +792,459 @@
       <w:r>
         <w:t>scikit</w:t>
       </w:r>
+      <w:proofErr w:type="spellEnd"/>
+      <w:r>
+        <w:t xml:space="preserve">-learn </w:t>
+      </w:r>
+      <w:proofErr w:type="spellStart"/>
+      <w:r>
+        <w:t>joblib</w:t>
+      </w:r>
+      <w:proofErr w:type="spellEnd"/>
+      <w:r>
+        <w:t xml:space="preserve"> </w:t>
+      </w:r>
+      <w:proofErr w:type="spellStart"/>
+      <w:r>
+        <w:t>fastapi</w:t>
+      </w:r>
+      <w:proofErr w:type="spellEnd"/>
+      <w:r>
+        <w:t xml:space="preserve"> </w:t>
+      </w:r>
+      <w:proofErr w:type="spellStart"/>
+      <w:r>
+        <w:t>uvicorn</w:t>
+      </w:r>
+      <w:proofErr w:type="spellEnd"/>
+      <w:r>
+        <w:t xml:space="preserve"> </w:t>
+      </w:r>
+      <w:proofErr w:type="spellStart"/>
+      <w:r>
+        <w:t>redis</w:t>
+      </w:r>
+      <w:proofErr w:type="spellEnd"/>
+      <w:r>
+        <w:t xml:space="preserve"> python-</w:t>
+      </w:r>
+      <w:proofErr w:type="spellStart"/>
+      <w:r>
+        <w:t>dotenv</w:t>
+      </w:r>
+      <w:proofErr w:type="spellEnd"/>
+      <w:r>
+        <w:t xml:space="preserve"> requests</w:t>
+      </w:r>
+    </w:p>
+    <w:p>
+      <w:r>
+        <w:t>DATASET DOWNLOAD</w:t>
+      </w:r>
+    </w:p>
+    <w:p>
+      <w:r>
+        <w:t xml:space="preserve">from this website: </w:t>
+      </w:r>
+      <w:hyperlink r:id="rId5" w:history="1">
+        <w:r>
+          <w:rPr>
+            <w:rStyle w:val="Hyperlink"/>
+          </w:rPr>
+          <w:t>https://www.kaggle.com/datasets/bcccdatasets/large-scale-ids-dataset-bccc-cse-cic-ids2018</w:t>
+        </w:r>
+      </w:hyperlink>
+      <w:r>
+        <w:t xml:space="preserve"> just download these:</w:t>
+      </w:r>
+    </w:p>
+    <w:p>
+      <w:pPr>
+        <w:pStyle w:val="ListParagraph"/>
+        <w:numPr>
+          <w:ilvl w:val="0"/>
+          <w:numId w:val="7"/>
+        </w:numPr>
+        <w:spacing w:before="240" w:after="0" w:line="240" w:lineRule="auto"/>
+        <w:rPr>
+          <w:rFonts w:ascii="Times New Roman" w:eastAsia="Times New Roman" w:hAnsi="Times New Roman" w:cs="Times New Roman"/>
+          <w:sz w:val="24"/>
+          <w:szCs w:val="24"/>
+          <w:lang w:eastAsia="en-IN"/>
+        </w:rPr>
+      </w:pPr>
+      <w:r>
+        <w:rPr>
+          <w:rFonts w:ascii="Times New Roman" w:eastAsia="Times New Roman" w:hAnsi="Times New Roman" w:cs="Times New Roman"/>
+          <w:sz w:val="24"/>
+          <w:szCs w:val="24"/>
+          <w:lang w:eastAsia="en-IN"/>
+        </w:rPr>
+        <w:t xml:space="preserve">friday_02_03_2018_benign, </w:t>
+      </w:r>
+    </w:p>
+    <w:p>
+      <w:pPr>
+        <w:pStyle w:val="ListParagraph"/>
+        <w:numPr>
+          <w:ilvl w:val="0"/>
+          <w:numId w:val="7"/>
+        </w:numPr>
+        <w:spacing w:before="240" w:after="0" w:line="240" w:lineRule="auto"/>
+        <w:rPr>
+          <w:rFonts w:ascii="Times New Roman" w:eastAsia="Times New Roman" w:hAnsi="Times New Roman" w:cs="Times New Roman"/>
+          <w:sz w:val="24"/>
+          <w:szCs w:val="24"/>
+          <w:lang w:eastAsia="en-IN"/>
+        </w:rPr>
+      </w:pPr>
+      <w:r>
+        <w:rPr>
+          <w:rFonts w:ascii="Times New Roman" w:eastAsia="Times New Roman" w:hAnsi="Times New Roman" w:cs="Times New Roman"/>
+          <w:sz w:val="24"/>
+          <w:szCs w:val="24"/>
+          <w:lang w:eastAsia="en-IN"/>
+        </w:rPr>
+        <w:t xml:space="preserve">friday_02_03_2018_bot, </w:t>
+      </w:r>
+    </w:p>
+    <w:p>
+      <w:pPr>
+        <w:pStyle w:val="ListParagraph"/>
+        <w:numPr>
+          <w:ilvl w:val="0"/>
+          <w:numId w:val="7"/>
+        </w:numPr>
+        <w:spacing w:before="240" w:after="0" w:line="240" w:lineRule="auto"/>
+        <w:rPr>
+          <w:rFonts w:ascii="Times New Roman" w:eastAsia="Times New Roman" w:hAnsi="Times New Roman" w:cs="Times New Roman"/>
+          <w:sz w:val="24"/>
+          <w:szCs w:val="24"/>
+          <w:lang w:eastAsia="en-IN"/>
+        </w:rPr>
+      </w:pPr>
+      <w:r>
+        <w:rPr>
+          <w:rFonts w:ascii="Times New Roman" w:eastAsia="Times New Roman" w:hAnsi="Times New Roman" w:cs="Times New Roman"/>
+          <w:sz w:val="24"/>
+          <w:szCs w:val="24"/>
+          <w:lang w:eastAsia="en-IN"/>
+        </w:rPr>
+        <w:t xml:space="preserve">thursday_01_03_2018_benign, </w:t>
+      </w:r>
+    </w:p>
+    <w:p>
+      <w:pPr>
+        <w:pStyle w:val="ListParagraph"/>
+        <w:numPr>
+          <w:ilvl w:val="0"/>
+          <w:numId w:val="7"/>
+        </w:numPr>
+        <w:spacing w:before="240" w:after="0" w:line="240" w:lineRule="auto"/>
+        <w:rPr>
+          <w:rFonts w:ascii="Times New Roman" w:eastAsia="Times New Roman" w:hAnsi="Times New Roman" w:cs="Times New Roman"/>
+          <w:sz w:val="24"/>
+          <w:szCs w:val="24"/>
+          <w:lang w:eastAsia="en-IN"/>
+        </w:rPr>
+      </w:pPr>
+      <w:r>
+        <w:rPr>
+          <w:rFonts w:ascii="Times New Roman" w:eastAsia="Times New Roman" w:hAnsi="Times New Roman" w:cs="Times New Roman"/>
+          <w:sz w:val="24"/>
+          <w:szCs w:val="24"/>
+          <w:lang w:eastAsia="en-IN"/>
+        </w:rPr>
+        <w:t xml:space="preserve">thursday_01_03_2018_infiltration, </w:t>
+      </w:r>
+    </w:p>
+    <w:p>
+      <w:pPr>
+        <w:pStyle w:val="ListParagraph"/>
+        <w:numPr>
+          <w:ilvl w:val="0"/>
+          <w:numId w:val="7"/>
+        </w:numPr>
+        <w:spacing w:before="240" w:after="0" w:line="240" w:lineRule="auto"/>
+        <w:rPr>
+          <w:rFonts w:ascii="Times New Roman" w:eastAsia="Times New Roman" w:hAnsi="Times New Roman" w:cs="Times New Roman"/>
+          <w:sz w:val="24"/>
+          <w:szCs w:val="24"/>
+          <w:lang w:eastAsia="en-IN"/>
+        </w:rPr>
+      </w:pPr>
+      <w:r>
+        <w:rPr>
+          <w:rFonts w:ascii="Times New Roman" w:eastAsia="Times New Roman" w:hAnsi="Times New Roman" w:cs="Times New Roman"/>
+          <w:sz w:val="24"/>
+          <w:szCs w:val="24"/>
+          <w:lang w:eastAsia="en-IN"/>
+        </w:rPr>
+        <w:t xml:space="preserve">thursday_15_02_2018_DoS_Golden_Eye, </w:t>
+      </w:r>
+    </w:p>
+    <w:p>
+      <w:pPr>
+        <w:pStyle w:val="ListParagraph"/>
+        <w:numPr>
+          <w:ilvl w:val="0"/>
+          <w:numId w:val="7"/>
+        </w:numPr>
+        <w:spacing w:before="240" w:after="0" w:line="240" w:lineRule="auto"/>
+        <w:rPr>
+          <w:rFonts w:ascii="Times New Roman" w:eastAsia="Times New Roman" w:hAnsi="Times New Roman" w:cs="Times New Roman"/>
+          <w:sz w:val="24"/>
+          <w:szCs w:val="24"/>
+          <w:lang w:eastAsia="en-IN"/>
+        </w:rPr>
+      </w:pPr>
+      <w:r>
+        <w:rPr>
+          <w:rFonts w:ascii="Times New Roman" w:eastAsia="Times New Roman" w:hAnsi="Times New Roman" w:cs="Times New Roman"/>
+          <w:sz w:val="24"/>
+          <w:szCs w:val="24"/>
+          <w:lang w:eastAsia="en-IN"/>
+        </w:rPr>
+        <w:t xml:space="preserve">thursday_15_02_2018_DoS_Slowloris, </w:t>
+      </w:r>
+    </w:p>
+    <w:p>
+      <w:pPr>
+        <w:pStyle w:val="ListParagraph"/>
+        <w:numPr>
+          <w:ilvl w:val="0"/>
+          <w:numId w:val="7"/>
+        </w:numPr>
+        <w:spacing w:before="240" w:after="0" w:line="240" w:lineRule="auto"/>
+        <w:rPr>
+          <w:rFonts w:ascii="Times New Roman" w:eastAsia="Times New Roman" w:hAnsi="Times New Roman" w:cs="Times New Roman"/>
+          <w:sz w:val="24"/>
+          <w:szCs w:val="24"/>
+          <w:lang w:eastAsia="en-IN"/>
+        </w:rPr>
+      </w:pPr>
+      <w:r>
+        <w:rPr>
+          <w:rFonts w:ascii="Times New Roman" w:eastAsia="Times New Roman" w:hAnsi="Times New Roman" w:cs="Times New Roman"/>
+          <w:sz w:val="24"/>
+          <w:szCs w:val="24"/>
+          <w:lang w:eastAsia="en-IN"/>
+        </w:rPr>
+        <w:t xml:space="preserve">thursday_15_02_2018_benign, </w:t>
+      </w:r>
+    </w:p>
+    <w:p>
+      <w:pPr>
+        <w:pStyle w:val="ListParagraph"/>
+        <w:numPr>
+          <w:ilvl w:val="0"/>
+          <w:numId w:val="7"/>
+        </w:numPr>
+        <w:spacing w:before="240" w:line="240" w:lineRule="auto"/>
+        <w:rPr>
+          <w:rFonts w:ascii="Times New Roman" w:eastAsia="Times New Roman" w:hAnsi="Times New Roman" w:cs="Times New Roman"/>
+          <w:sz w:val="24"/>
+          <w:szCs w:val="24"/>
+          <w:lang w:eastAsia="en-IN"/>
+        </w:rPr>
+      </w:pPr>
+      <w:r>
+        <w:rPr>
+          <w:rFonts w:ascii="Times New Roman" w:eastAsia="Times New Roman" w:hAnsi="Times New Roman" w:cs="Times New Roman"/>
+          <w:sz w:val="24"/>
+          <w:szCs w:val="24"/>
+          <w:lang w:eastAsia="en-IN"/>
+        </w:rPr>
+        <w:t xml:space="preserve">friday_23_02_2018_SQL_Injection, </w:t>
+      </w:r>
+    </w:p>
+    <w:p>
+      <w:pPr>
+        <w:pStyle w:val="ListParagraph"/>
+        <w:numPr>
+          <w:ilvl w:val="0"/>
+          <w:numId w:val="7"/>
+        </w:numPr>
+        <w:spacing w:before="240" w:line="240" w:lineRule="auto"/>
+        <w:rPr>
+          <w:rFonts w:ascii="Times New Roman" w:eastAsia="Times New Roman" w:hAnsi="Times New Roman" w:cs="Times New Roman"/>
+          <w:sz w:val="24"/>
+          <w:szCs w:val="24"/>
+          <w:lang w:eastAsia="en-IN"/>
+        </w:rPr>
+      </w:pPr>
+      <w:r>
+        <w:rPr>
+          <w:rFonts w:ascii="Times New Roman" w:eastAsia="Times New Roman" w:hAnsi="Times New Roman" w:cs="Times New Roman"/>
+          <w:sz w:val="24"/>
+          <w:szCs w:val="24"/>
+          <w:lang w:eastAsia="en-IN"/>
+        </w:rPr>
+        <w:t xml:space="preserve">friday_23_02_2018_BF_web, </w:t>
+      </w:r>
+    </w:p>
+    <w:p>
+      <w:pPr>
+        <w:pStyle w:val="ListParagraph"/>
+        <w:numPr>
+          <w:ilvl w:val="0"/>
+          <w:numId w:val="7"/>
+        </w:numPr>
+        <w:spacing w:before="240" w:line="240" w:lineRule="auto"/>
+        <w:rPr>
+          <w:rFonts w:ascii="Times New Roman" w:eastAsia="Times New Roman" w:hAnsi="Times New Roman" w:cs="Times New Roman"/>
+          <w:sz w:val="24"/>
+          <w:szCs w:val="24"/>
+          <w:lang w:eastAsia="en-IN"/>
+        </w:rPr>
+      </w:pPr>
+      <w:r>
+        <w:rPr>
+          <w:rFonts w:ascii="Times New Roman" w:eastAsia="Times New Roman" w:hAnsi="Times New Roman" w:cs="Times New Roman"/>
+          <w:sz w:val="24"/>
+          <w:szCs w:val="24"/>
+          <w:lang w:eastAsia="en-IN"/>
+        </w:rPr>
+        <w:t xml:space="preserve">friday_23_02_2018_benign, </w:t>
+      </w:r>
+    </w:p>
+    <w:p>
+      <w:pPr>
+        <w:pStyle w:val="ListParagraph"/>
+        <w:numPr>
+          <w:ilvl w:val="0"/>
+          <w:numId w:val="7"/>
+        </w:numPr>
+        <w:spacing w:before="240" w:line="240" w:lineRule="auto"/>
+        <w:rPr>
+          <w:rFonts w:ascii="Times New Roman" w:eastAsia="Times New Roman" w:hAnsi="Times New Roman" w:cs="Times New Roman"/>
+          <w:sz w:val="24"/>
+          <w:szCs w:val="24"/>
+          <w:lang w:eastAsia="en-IN"/>
+        </w:rPr>
+      </w:pPr>
+      <w:r>
+        <w:rPr>
+          <w:rFonts w:ascii="Times New Roman" w:eastAsia="Times New Roman" w:hAnsi="Times New Roman" w:cs="Times New Roman"/>
+          <w:sz w:val="24"/>
+          <w:szCs w:val="24"/>
+          <w:lang w:eastAsia="en-IN"/>
+        </w:rPr>
+        <w:t xml:space="preserve">wednesday_14_02_2018_BF_SSH, </w:t>
+      </w:r>
+    </w:p>
+    <w:p>
+      <w:pPr>
+        <w:pStyle w:val="ListParagraph"/>
+        <w:numPr>
+          <w:ilvl w:val="0"/>
+          <w:numId w:val="7"/>
+        </w:numPr>
+        <w:spacing w:before="240" w:line="240" w:lineRule="auto"/>
+        <w:rPr>
+          <w:rFonts w:ascii="Times New Roman" w:eastAsia="Times New Roman" w:hAnsi="Times New Roman" w:cs="Times New Roman"/>
+          <w:sz w:val="24"/>
+          <w:szCs w:val="24"/>
+          <w:lang w:eastAsia="en-IN"/>
+        </w:rPr>
+      </w:pPr>
+      <w:r>
+        <w:rPr>
+          <w:rFonts w:ascii="Times New Roman" w:eastAsia="Times New Roman" w:hAnsi="Times New Roman" w:cs="Times New Roman"/>
+          <w:sz w:val="24"/>
+          <w:szCs w:val="24"/>
+          <w:lang w:eastAsia="en-IN"/>
+        </w:rPr>
+        <w:t xml:space="preserve">wednesday_14_02_2018_BF_FTP, </w:t>
+      </w:r>
+    </w:p>
+    <w:p>
+      <w:pPr>
+        <w:pStyle w:val="ListParagraph"/>
+        <w:numPr>
+          <w:ilvl w:val="0"/>
+          <w:numId w:val="7"/>
+        </w:numPr>
+        <w:spacing w:before="240" w:line="240" w:lineRule="auto"/>
+        <w:rPr>
+          <w:rFonts w:ascii="Times New Roman" w:eastAsia="Times New Roman" w:hAnsi="Times New Roman" w:cs="Times New Roman"/>
+          <w:sz w:val="24"/>
+          <w:szCs w:val="24"/>
+          <w:lang w:eastAsia="en-IN"/>
+        </w:rPr>
+      </w:pPr>
+      <w:r>
+        <w:rPr>
+          <w:rFonts w:ascii="Times New Roman" w:eastAsia="Times New Roman" w:hAnsi="Times New Roman" w:cs="Times New Roman"/>
+          <w:sz w:val="24"/>
+          <w:szCs w:val="24"/>
+          <w:lang w:eastAsia="en-IN"/>
+        </w:rPr>
+        <w:t xml:space="preserve">wednesday_14_02_2018_benign, </w:t>
+      </w:r>
+    </w:p>
+    <w:p>
+      <w:pPr>
+        <w:pStyle w:val="ListParagraph"/>
+        <w:numPr>
+          <w:ilvl w:val="0"/>
+          <w:numId w:val="7"/>
+        </w:numPr>
+        <w:spacing w:before="240" w:line="240" w:lineRule="auto"/>
+        <w:rPr>
+          <w:rFonts w:ascii="Times New Roman" w:eastAsia="Times New Roman" w:hAnsi="Times New Roman" w:cs="Times New Roman"/>
+          <w:sz w:val="24"/>
+          <w:szCs w:val="24"/>
+          <w:lang w:eastAsia="en-IN"/>
+        </w:rPr>
+      </w:pPr>
+      <w:r>
+        <w:rPr>
+          <w:rFonts w:ascii="Times New Roman" w:eastAsia="Times New Roman" w:hAnsi="Times New Roman" w:cs="Times New Roman"/>
+          <w:sz w:val="24"/>
+          <w:szCs w:val="24"/>
+          <w:lang w:eastAsia="en-IN"/>
+        </w:rPr>
+        <w:t xml:space="preserve">tuesday_20_02_2018_loic_http, </w:t>
+      </w:r>
+    </w:p>
+    <w:p>
+      <w:pPr>
+        <w:pStyle w:val="ListParagraph"/>
+        <w:numPr>
+          <w:ilvl w:val="0"/>
+          <w:numId w:val="7"/>
+        </w:numPr>
+        <w:spacing w:before="240" w:line="240" w:lineRule="auto"/>
+      </w:pPr>
+      <w:r>
+        <w:rPr>
+          <w:rFonts w:ascii="Times New Roman" w:eastAsia="Times New Roman" w:hAnsi="Times New Roman" w:cs="Times New Roman"/>
+          <w:sz w:val="24"/>
+          <w:szCs w:val="24"/>
+          <w:lang w:eastAsia="en-IN"/>
+        </w:rPr>
+        <w:t>tuesday_20_02_2018_benign</w:t>
+      </w:r>
+    </w:p>
+    <w:p>
+      <w:pPr>
+        <w:spacing w:before="240" w:line="240" w:lineRule="auto"/>
+      </w:pPr>
+      <w:r>
+        <w:lastRenderedPageBreak/>
+        <w:t>RUN COMMANDS:</w:t>
+      </w:r>
+    </w:p>
+    <w:p>
+      <w:pPr>
+        <w:spacing w:before="240" w:line="240" w:lineRule="auto"/>
+      </w:pPr>
+      <w:r>
+        <w:t>to train the model run this comman</w:t>
+      </w:r>
       <w:bookmarkStart w:id="0" w:name="_GoBack"/>
       <w:bookmarkEnd w:id="0"/>
-      <w:proofErr w:type="spellEnd"/>
-      <w:r>
-        <w:t xml:space="preserve">-learn </w:t>
-      </w:r>
-      <w:proofErr w:type="spellStart"/>
-      <w:r>
-        <w:t>joblib</w:t>
-      </w:r>
-      <w:proofErr w:type="spellEnd"/>
-      <w:r>
-        <w:t xml:space="preserve"> </w:t>
-      </w:r>
-      <w:proofErr w:type="spellStart"/>
-      <w:r>
-        <w:t>fastapi</w:t>
-      </w:r>
-      <w:proofErr w:type="spellEnd"/>
-      <w:r>
-        <w:t xml:space="preserve"> </w:t>
-      </w:r>
-      <w:proofErr w:type="spellStart"/>
-      <w:r>
-        <w:t>uvicorn</w:t>
-      </w:r>
-      <w:proofErr w:type="spellEnd"/>
-      <w:r>
-        <w:t xml:space="preserve"> </w:t>
-      </w:r>
-      <w:proofErr w:type="spellStart"/>
-      <w:r>
-        <w:t>redis</w:t>
-      </w:r>
-      <w:proofErr w:type="spellEnd"/>
-      <w:r>
-        <w:t xml:space="preserve"> python-</w:t>
-      </w:r>
-      <w:proofErr w:type="spellStart"/>
-      <w:r>
-        <w:t>dotenv</w:t>
-      </w:r>
-      <w:proofErr w:type="spellEnd"/>
-      <w:r>
-        <w:t xml:space="preserve"> requests</w:t>
-      </w:r>
     </w:p>
     <w:sectPr>
       <w:pgSz w:w="11906" w:h="16838"/>
@@ -1525,6 +1932,92 @@
     </w:lvl>
   </w:abstractNum>
   <w:abstractNum w:abstractNumId="5" w15:restartNumberingAfterBreak="0">
+    <w:nsid w:val="51D348B3"/>
+    <w:multiLevelType w:val="hybridMultilevel"/>
+    <w:tmpl w:val="804A2D7E"/>
+    <w:lvl w:ilvl="0" w:tplc="4009000F">
+      <w:start w:val="1"/>
+      <w:numFmt w:val="decimal"/>
+      <w:lvlText w:val="%1."/>
+      <w:lvlJc w:val="left"/>
+      <w:pPr>
+        <w:ind w:left="720" w:hanging="360"/>
+      </w:pPr>
+    </w:lvl>
+    <w:lvl w:ilvl="1" w:tplc="40090019" w:tentative="1">
+      <w:start w:val="1"/>
+      <w:numFmt w:val="lowerLetter"/>
+      <w:lvlText w:val="%2."/>
+      <w:lvlJc w:val="left"/>
+      <w:pPr>
+        <w:ind w:left="1440" w:hanging="360"/>
+      </w:pPr>
+    </w:lvl>
+    <w:lvl w:ilvl="2" w:tplc="4009001B" w:tentative="1">
+      <w:start w:val="1"/>
+      <w:numFmt w:val="lowerRoman"/>
+      <w:lvlText w:val="%3."/>
+      <w:lvlJc w:val="right"/>
+      <w:pPr>
+        <w:ind w:left="2160" w:hanging="180"/>
+      </w:pPr>
+    </w:lvl>
+    <w:lvl w:ilvl="3" w:tplc="4009000F" w:tentative="1">
+      <w:start w:val="1"/>
+      <w:numFmt w:val="decimal"/>
+      <w:lvlText w:val="%4."/>
+      <w:lvlJc w:val="left"/>
+      <w:pPr>
+        <w:ind w:left="2880" w:hanging="360"/>
+      </w:pPr>
+    </w:lvl>
+    <w:lvl w:ilvl="4" w:tplc="40090019" w:tentative="1">
+      <w:start w:val="1"/>
+      <w:numFmt w:val="lowerLetter"/>
+      <w:lvlText w:val="%5."/>
+      <w:lvlJc w:val="left"/>
+      <w:pPr>
+        <w:ind w:left="3600" w:hanging="360"/>
+      </w:pPr>
+    </w:lvl>
+    <w:lvl w:ilvl="5" w:tplc="4009001B" w:tentative="1">
+      <w:start w:val="1"/>
+      <w:numFmt w:val="lowerRoman"/>
+      <w:lvlText w:val="%6."/>
+      <w:lvlJc w:val="right"/>
+      <w:pPr>
+        <w:ind w:left="4320" w:hanging="180"/>
+      </w:pPr>
+    </w:lvl>
+    <w:lvl w:ilvl="6" w:tplc="4009000F" w:tentative="1">
+      <w:start w:val="1"/>
+      <w:numFmt w:val="decimal"/>
+      <w:lvlText w:val="%7."/>
+      <w:lvlJc w:val="left"/>
+      <w:pPr>
+        <w:ind w:left="5040" w:hanging="360"/>
+      </w:pPr>
+    </w:lvl>
+    <w:lvl w:ilvl="7" w:tplc="40090019" w:tentative="1">
+      <w:start w:val="1"/>
+      <w:numFmt w:val="lowerLetter"/>
+      <w:lvlText w:val="%8."/>
+      <w:lvlJc w:val="left"/>
+      <w:pPr>
+        <w:ind w:left="5760" w:hanging="360"/>
+      </w:pPr>
+    </w:lvl>
+    <w:lvl w:ilvl="8" w:tplc="4009001B" w:tentative="1">
+      <w:start w:val="1"/>
+      <w:numFmt w:val="lowerRoman"/>
+      <w:lvlText w:val="%9."/>
+      <w:lvlJc w:val="right"/>
+      <w:pPr>
+        <w:ind w:left="6480" w:hanging="180"/>
+      </w:pPr>
+    </w:lvl>
+  </w:abstractNum>
+  <w:abstractNum w:abstractNumId="6" w15:restartNumberingAfterBreak="0">
     <w:nsid w:val="62494AE1"/>
     <w:multiLevelType w:val="multilevel"/>
     <w:tmpl w:val="D8A268AA"/>
@@ -1673,8 +2166,120 @@
       </w:rPr>
     </w:lvl>
   </w:abstractNum>
+  <w:abstractNum w:abstractNumId="7" w15:restartNumberingAfterBreak="0">
+    <w:nsid w:val="7AB41280"/>
+    <w:multiLevelType w:val="hybridMultilevel"/>
+    <w:tmpl w:val="4AE8F6A0"/>
+    <w:lvl w:ilvl="0" w:tplc="EF2861C6">
+      <w:numFmt w:val="bullet"/>
+      <w:lvlText w:val="-"/>
+      <w:lvlJc w:val="left"/>
+      <w:pPr>
+        <w:ind w:left="720" w:hanging="360"/>
+      </w:pPr>
+      <w:rPr>
+        <w:rFonts w:ascii="Calibri" w:eastAsiaTheme="minorHAnsi" w:hAnsi="Calibri" w:cs="Calibri" w:hint="default"/>
+      </w:rPr>
+    </w:lvl>
+    <w:lvl w:ilvl="1" w:tplc="40090003" w:tentative="1">
+      <w:start w:val="1"/>
+      <w:numFmt w:val="bullet"/>
+      <w:lvlText w:val="o"/>
+      <w:lvlJc w:val="left"/>
+      <w:pPr>
+        <w:ind w:left="1440" w:hanging="360"/>
+      </w:pPr>
+      <w:rPr>
+        <w:rFonts w:ascii="Courier New" w:hAnsi="Courier New" w:cs="Courier New" w:hint="default"/>
+      </w:rPr>
+    </w:lvl>
+    <w:lvl w:ilvl="2" w:tplc="40090005" w:tentative="1">
+      <w:start w:val="1"/>
+      <w:numFmt w:val="bullet"/>
+      <w:lvlText w:val=""/>
+      <w:lvlJc w:val="left"/>
+      <w:pPr>
+        <w:ind w:left="2160" w:hanging="360"/>
+      </w:pPr>
+      <w:rPr>
+        <w:rFonts w:ascii="Wingdings" w:hAnsi="Wingdings" w:hint="default"/>
+      </w:rPr>
+    </w:lvl>
+    <w:lvl w:ilvl="3" w:tplc="40090001" w:tentative="1">
+      <w:start w:val="1"/>
+      <w:numFmt w:val="bullet"/>
+      <w:lvlText w:val=""/>
+      <w:lvlJc w:val="left"/>
+      <w:pPr>
+        <w:ind w:left="2880" w:hanging="360"/>
+      </w:pPr>
+      <w:rPr>
+        <w:rFonts w:ascii="Symbol" w:hAnsi="Symbol" w:hint="default"/>
+      </w:rPr>
+    </w:lvl>
+    <w:lvl w:ilvl="4" w:tplc="40090003" w:tentative="1">
+      <w:start w:val="1"/>
+      <w:numFmt w:val="bullet"/>
+      <w:lvlText w:val="o"/>
+      <w:lvlJc w:val="left"/>
+      <w:pPr>
+        <w:ind w:left="3600" w:hanging="360"/>
+      </w:pPr>
+      <w:rPr>
+        <w:rFonts w:ascii="Courier New" w:hAnsi="Courier New" w:cs="Courier New" w:hint="default"/>
+      </w:rPr>
+    </w:lvl>
+    <w:lvl w:ilvl="5" w:tplc="40090005" w:tentative="1">
+      <w:start w:val="1"/>
+      <w:numFmt w:val="bullet"/>
+      <w:lvlText w:val=""/>
+      <w:lvlJc w:val="left"/>
+      <w:pPr>
+        <w:ind w:left="4320" w:hanging="360"/>
+      </w:pPr>
+      <w:rPr>
+        <w:rFonts w:ascii="Wingdings" w:hAnsi="Wingdings" w:hint="default"/>
+      </w:rPr>
+    </w:lvl>
+    <w:lvl w:ilvl="6" w:tplc="40090001" w:tentative="1">
+      <w:start w:val="1"/>
+      <w:numFmt w:val="bullet"/>
+      <w:lvlText w:val=""/>
+      <w:lvlJc w:val="left"/>
+      <w:pPr>
+        <w:ind w:left="5040" w:hanging="360"/>
+      </w:pPr>
+      <w:rPr>
+        <w:rFonts w:ascii="Symbol" w:hAnsi="Symbol" w:hint="default"/>
+      </w:rPr>
+    </w:lvl>
+    <w:lvl w:ilvl="7" w:tplc="40090003" w:tentative="1">
+      <w:start w:val="1"/>
+      <w:numFmt w:val="bullet"/>
+      <w:lvlText w:val="o"/>
+      <w:lvlJc w:val="left"/>
+      <w:pPr>
+        <w:ind w:left="5760" w:hanging="360"/>
+      </w:pPr>
+      <w:rPr>
+        <w:rFonts w:ascii="Courier New" w:hAnsi="Courier New" w:cs="Courier New" w:hint="default"/>
+      </w:rPr>
+    </w:lvl>
+    <w:lvl w:ilvl="8" w:tplc="40090005" w:tentative="1">
+      <w:start w:val="1"/>
+      <w:numFmt w:val="bullet"/>
+      <w:lvlText w:val=""/>
+      <w:lvlJc w:val="left"/>
+      <w:pPr>
+        <w:ind w:left="6480" w:hanging="360"/>
+      </w:pPr>
+      <w:rPr>
+        <w:rFonts w:ascii="Wingdings" w:hAnsi="Wingdings" w:hint="default"/>
+      </w:rPr>
+    </w:lvl>
+  </w:abstractNum>
   <w:num w:numId="1">
-    <w:abstractNumId w:val="5"/>
+    <w:abstractNumId w:val="6"/>
   </w:num>
   <w:num w:numId="2">
     <w:abstractNumId w:val="1"/>
@@ -1690,6 +2295,12 @@
   </w:num>
   <w:num w:numId="6">
     <w:abstractNumId w:val="2"/>
+  </w:num>
+  <w:num w:numId="7">
+    <w:abstractNumId w:val="5"/>
+  </w:num>
+  <w:num w:numId="8">
+    <w:abstractNumId w:val="7"/>
   </w:num>
 </w:numbering>
 </file>
@@ -2295,6 +2906,17 @@
       <w:szCs w:val="32"/>
     </w:rPr>
   </w:style>
+  <w:style w:type="character" w:styleId="Hyperlink">
+    <w:name w:val="Hyperlink"/>
+    <w:basedOn w:val="DefaultParagraphFont"/>
+    <w:uiPriority w:val="99"/>
+    <w:unhideWhenUsed/>
+    <w:rsid w:val="003947DF"/>
+    <w:rPr>
+      <w:color w:val="0563C1" w:themeColor="hyperlink"/>
+      <w:u w:val="single"/>
+    </w:rPr>
+  </w:style>
 </w:styles>
 </file>
 

</xml_diff>